<commit_message>
The Life of Tycho Brahe talk update
</commit_message>
<xml_diff>
--- a/Main meeting 21.03.2026 - The Life Of Tycho Brahe/RAS - TLOB 21.03.2026 presentation notes.docx
+++ b/Main meeting 21.03.2026 - The Life Of Tycho Brahe/RAS - TLOB 21.03.2026 presentation notes.docx
@@ -123,28 +123,35 @@
         </w:rPr>
         <w:t>important – restoration of astronomy</w:t>
       </w:r>
-    </w:p>
-    <w:p>
-      <w:pPr>
-        <w:rPr>
-          <w:sz w:val="36"/>
-          <w:szCs w:val="36"/>
-        </w:rPr>
-      </w:pPr>
-    </w:p>
-    <w:p>
-      <w:pPr>
-        <w:rPr>
-          <w:sz w:val="36"/>
-          <w:szCs w:val="36"/>
-        </w:rPr>
-      </w:pPr>
-      <w:r>
-        <w:rPr>
-          <w:sz w:val="36"/>
-          <w:szCs w:val="36"/>
-        </w:rPr>
-        <w:t>Key transitional figure in astronomy between the ancient model of perfect crystalline orbs carrying the planets around the Earth in perfect circles…</w:t>
+      <w:r>
+        <w:rPr>
+          <w:sz w:val="36"/>
+          <w:szCs w:val="36"/>
+        </w:rPr>
+        <w:t>, by determining the positions of the stars and planets to an unprecedented level of accuracy</w:t>
+      </w:r>
+    </w:p>
+    <w:p>
+      <w:pPr>
+        <w:rPr>
+          <w:sz w:val="36"/>
+          <w:szCs w:val="36"/>
+        </w:rPr>
+      </w:pPr>
+    </w:p>
+    <w:p>
+      <w:pPr>
+        <w:rPr>
+          <w:sz w:val="36"/>
+          <w:szCs w:val="36"/>
+        </w:rPr>
+      </w:pPr>
+      <w:r>
+        <w:rPr>
+          <w:sz w:val="36"/>
+          <w:szCs w:val="36"/>
+        </w:rPr>
+        <w:t>Key transitional figure between the ancient model of perfect crystalline orbs carrying the planets around the Earth in perfect circles…</w:t>
       </w:r>
     </w:p>
     <w:p>
@@ -447,6 +454,15 @@
         <w:lastRenderedPageBreak/>
         <w:t>Education and Inspiration</w:t>
       </w:r>
+      <w:r>
+        <w:rPr>
+          <w:b/>
+          <w:bCs/>
+          <w:sz w:val="36"/>
+          <w:szCs w:val="36"/>
+        </w:rPr>
+        <w:t xml:space="preserve"> *</w:t>
+      </w:r>
     </w:p>
     <w:p>
       <w:pPr>
@@ -947,7 +963,16 @@
           <w:sz w:val="36"/>
           <w:szCs w:val="36"/>
         </w:rPr>
-        <w:t>Witnesses G</w:t>
+        <w:t xml:space="preserve">Witnesses </w:t>
+      </w:r>
+      <w:r>
+        <w:rPr>
+          <w:b/>
+          <w:bCs/>
+          <w:sz w:val="36"/>
+          <w:szCs w:val="36"/>
+        </w:rPr>
+        <w:t>G</w:t>
       </w:r>
       <w:r>
         <w:rPr>
@@ -1663,7 +1688,21 @@
           <w:sz w:val="36"/>
           <w:szCs w:val="36"/>
         </w:rPr>
-        <w:t>Extensive buildings, grounds, a substantial income from thirteen parishes</w:t>
+        <w:t xml:space="preserve">Extensive buildings, grounds, a substantial income from </w:t>
+      </w:r>
+      <w:r>
+        <w:rPr>
+          <w:sz w:val="36"/>
+          <w:szCs w:val="36"/>
+        </w:rPr>
+        <w:t>13</w:t>
+      </w:r>
+      <w:r>
+        <w:rPr>
+          <w:sz w:val="36"/>
+          <w:szCs w:val="36"/>
+        </w:rPr>
+        <w:t xml:space="preserve"> parishes</w:t>
       </w:r>
     </w:p>
     <w:p>
@@ -1725,33 +1764,67 @@
           <w:sz w:val="36"/>
           <w:szCs w:val="36"/>
         </w:rPr>
-        <w:t>, brass and iron forge</w:t>
-      </w:r>
-    </w:p>
-    <w:p>
-      <w:pPr>
-        <w:rPr>
-          <w:sz w:val="36"/>
-          <w:szCs w:val="36"/>
-        </w:rPr>
-      </w:pPr>
-    </w:p>
-    <w:p>
-      <w:pPr>
-        <w:rPr>
-          <w:b/>
-          <w:bCs/>
-          <w:sz w:val="36"/>
-          <w:szCs w:val="36"/>
-        </w:rPr>
-      </w:pPr>
-      <w:r>
-        <w:rPr>
-          <w:b/>
-          <w:bCs/>
-          <w:sz w:val="36"/>
-          <w:szCs w:val="36"/>
-        </w:rPr>
+        <w:t>, brass</w:t>
+      </w:r>
+      <w:r>
+        <w:rPr>
+          <w:sz w:val="36"/>
+          <w:szCs w:val="36"/>
+        </w:rPr>
+        <w:t>-founder</w:t>
+      </w:r>
+      <w:r>
+        <w:rPr>
+          <w:sz w:val="36"/>
+          <w:szCs w:val="36"/>
+        </w:rPr>
+        <w:t xml:space="preserve"> and iron forge</w:t>
+      </w:r>
+    </w:p>
+    <w:p>
+      <w:pPr>
+        <w:rPr>
+          <w:sz w:val="36"/>
+          <w:szCs w:val="36"/>
+        </w:rPr>
+      </w:pPr>
+    </w:p>
+    <w:p>
+      <w:pPr>
+        <w:rPr>
+          <w:b/>
+          <w:bCs/>
+          <w:sz w:val="36"/>
+          <w:szCs w:val="36"/>
+        </w:rPr>
+      </w:pPr>
+      <w:r>
+        <w:rPr>
+          <w:b/>
+          <w:bCs/>
+          <w:sz w:val="36"/>
+          <w:szCs w:val="36"/>
+        </w:rPr>
+        <w:br w:type="page"/>
+      </w:r>
+    </w:p>
+    <w:p>
+      <w:pPr>
+        <w:rPr>
+          <w:b/>
+          <w:bCs/>
+          <w:sz w:val="36"/>
+          <w:szCs w:val="36"/>
+        </w:rPr>
+      </w:pPr>
+      <w:r>
+        <w:rPr>
+          <w:b/>
+          <w:bCs/>
+          <w:sz w:val="36"/>
+          <w:szCs w:val="36"/>
+        </w:rPr>
+        <w:lastRenderedPageBreak/>
         <w:t>11</w:t>
       </w:r>
       <w:r>
@@ -1820,36 +1893,6 @@
     </w:p>
     <w:p>
       <w:pPr>
-        <w:rPr>
-          <w:sz w:val="36"/>
-          <w:szCs w:val="36"/>
-        </w:rPr>
-      </w:pPr>
-      <w:r>
-        <w:rPr>
-          <w:sz w:val="36"/>
-          <w:szCs w:val="36"/>
-        </w:rPr>
-        <w:t>Aristotle 4</w:t>
-      </w:r>
-      <w:r>
-        <w:rPr>
-          <w:sz w:val="36"/>
-          <w:szCs w:val="36"/>
-          <w:vertAlign w:val="superscript"/>
-        </w:rPr>
-        <w:t>th</w:t>
-      </w:r>
-      <w:r>
-        <w:rPr>
-          <w:sz w:val="36"/>
-          <w:szCs w:val="36"/>
-        </w:rPr>
-        <w:t xml:space="preserve"> Century BC</w:t>
-      </w:r>
-    </w:p>
-    <w:p>
-      <w:pPr>
         <w:pStyle w:val="ListParagraph"/>
         <w:ind w:left="0"/>
         <w:rPr>
@@ -1857,12 +1900,29 @@
           <w:szCs w:val="36"/>
         </w:rPr>
       </w:pPr>
+    </w:p>
+    <w:p>
+      <w:pPr>
+        <w:pStyle w:val="ListParagraph"/>
+        <w:ind w:left="0"/>
+        <w:rPr>
+          <w:sz w:val="36"/>
+          <w:szCs w:val="36"/>
+        </w:rPr>
+      </w:pPr>
       <w:r>
         <w:rPr>
           <w:sz w:val="36"/>
           <w:szCs w:val="36"/>
         </w:rPr>
         <w:t>But there was none -&gt; must be beyond the Moon</w:t>
+      </w:r>
+      <w:r>
+        <w:rPr>
+          <w:sz w:val="36"/>
+          <w:szCs w:val="36"/>
+        </w:rPr>
+        <w:t xml:space="preserve"> -&gt;against Aristotle</w:t>
       </w:r>
     </w:p>
     <w:p>
@@ -2006,26 +2066,8 @@
           <w:sz w:val="32"/>
           <w:szCs w:val="32"/>
         </w:rPr>
-        <w:t xml:space="preserve">Introduce powerful Astrological effects: Spoke of political changes since the rise of the Roman Empire, influencing rulers born under sign of Taurus, and working especially in </w:t>
-      </w:r>
-      <w:r>
-        <w:rPr>
-          <w:sz w:val="32"/>
-          <w:szCs w:val="32"/>
-        </w:rPr>
-        <w:lastRenderedPageBreak/>
-        <w:t>Russia, Livonia, Finland, Sweden, southern Norway and adjacent regions</w:t>
-      </w:r>
-    </w:p>
-    <w:p>
-      <w:pPr>
-        <w:pStyle w:val="ListParagraph"/>
-        <w:ind w:left="0"/>
-        <w:rPr>
-          <w:sz w:val="36"/>
-          <w:szCs w:val="36"/>
-        </w:rPr>
-      </w:pPr>
+        <w:t>Introduce powerful Astrological effects: Spoke of political changes since the rise of the Roman Empire, influencing rulers born under sign of Taurus, and working especially in Russia, Livonia, Finland, Sweden, southern Norway and adjacent regions</w:t>
+      </w:r>
     </w:p>
     <w:p>
       <w:pPr>
@@ -2118,32 +2160,34 @@
         </w:rPr>
         <w:t>Falls in Love</w:t>
       </w:r>
+      <w:r>
+        <w:rPr>
+          <w:b/>
+          <w:bCs/>
+          <w:sz w:val="36"/>
+          <w:szCs w:val="36"/>
+        </w:rPr>
+        <w:t xml:space="preserve">: </w:t>
+      </w:r>
+      <w:r>
+        <w:rPr>
+          <w:sz w:val="36"/>
+          <w:szCs w:val="36"/>
+        </w:rPr>
+        <w:t>Kirsten Jorgensdatter</w:t>
+      </w:r>
     </w:p>
     <w:p>
       <w:pPr>
         <w:pStyle w:val="ListParagraph"/>
         <w:ind w:left="0"/>
         <w:rPr>
-          <w:sz w:val="36"/>
-          <w:szCs w:val="36"/>
-        </w:rPr>
-      </w:pPr>
-      <w:r>
-        <w:rPr>
-          <w:b/>
-          <w:bCs/>
-          <w:sz w:val="36"/>
-          <w:szCs w:val="36"/>
-        </w:rPr>
-        <w:tab/>
-      </w:r>
-      <w:r>
-        <w:rPr>
-          <w:sz w:val="36"/>
-          <w:szCs w:val="36"/>
-        </w:rPr>
-        <w:t>Kirsten Jorgensdatter</w:t>
-      </w:r>
+          <w:b/>
+          <w:bCs/>
+          <w:sz w:val="36"/>
+          <w:szCs w:val="36"/>
+        </w:rPr>
+      </w:pPr>
     </w:p>
     <w:p>
       <w:pPr>
@@ -2154,16 +2198,6 @@
           <w:szCs w:val="36"/>
         </w:rPr>
       </w:pPr>
-    </w:p>
-    <w:p>
-      <w:pPr>
-        <w:pStyle w:val="ListParagraph"/>
-        <w:ind w:left="0"/>
-        <w:rPr>
-          <w:sz w:val="36"/>
-          <w:szCs w:val="36"/>
-        </w:rPr>
-      </w:pPr>
       <w:r>
         <w:rPr>
           <w:b/>
@@ -2202,27 +2236,20 @@
     <w:p>
       <w:pPr>
         <w:rPr>
-          <w:sz w:val="36"/>
-          <w:szCs w:val="36"/>
-        </w:rPr>
-      </w:pPr>
-    </w:p>
-    <w:p>
-      <w:pPr>
-        <w:rPr>
-          <w:b/>
-          <w:bCs/>
-          <w:sz w:val="36"/>
-          <w:szCs w:val="36"/>
-        </w:rPr>
-      </w:pPr>
-      <w:r>
-        <w:rPr>
-          <w:b/>
-          <w:bCs/>
-          <w:sz w:val="36"/>
-          <w:szCs w:val="36"/>
-        </w:rPr>
+          <w:b/>
+          <w:bCs/>
+          <w:sz w:val="36"/>
+          <w:szCs w:val="36"/>
+        </w:rPr>
+      </w:pPr>
+      <w:r>
+        <w:rPr>
+          <w:b/>
+          <w:bCs/>
+          <w:sz w:val="36"/>
+          <w:szCs w:val="36"/>
+        </w:rPr>
+        <w:lastRenderedPageBreak/>
         <w:t xml:space="preserve">1574: </w:t>
       </w:r>
       <w:r>
@@ -2384,6 +2411,26 @@
           <w:sz w:val="36"/>
           <w:szCs w:val="36"/>
         </w:rPr>
+        <w:br w:type="page"/>
+      </w:r>
+    </w:p>
+    <w:p>
+      <w:pPr>
+        <w:rPr>
+          <w:b/>
+          <w:bCs/>
+          <w:sz w:val="36"/>
+          <w:szCs w:val="36"/>
+        </w:rPr>
+      </w:pPr>
+      <w:r>
+        <w:rPr>
+          <w:b/>
+          <w:bCs/>
+          <w:sz w:val="36"/>
+          <w:szCs w:val="36"/>
+        </w:rPr>
+        <w:lastRenderedPageBreak/>
         <w:t>King's offer of the island of Hven</w:t>
       </w:r>
     </w:p>
@@ -2508,7 +2555,21 @@
           <w:sz w:val="36"/>
           <w:szCs w:val="36"/>
         </w:rPr>
-        <w:t>176:</w:t>
+        <w:t>1</w:t>
+      </w:r>
+      <w:r>
+        <w:rPr>
+          <w:sz w:val="36"/>
+          <w:szCs w:val="36"/>
+        </w:rPr>
+        <w:t>5</w:t>
+      </w:r>
+      <w:r>
+        <w:rPr>
+          <w:sz w:val="36"/>
+          <w:szCs w:val="36"/>
+        </w:rPr>
+        <w:t>76:</w:t>
       </w:r>
     </w:p>
     <w:p>
@@ -2668,19 +2729,47 @@
         <w:rPr>
           <w:b/>
           <w:bCs/>
-          <w:sz w:val="32"/>
-          <w:szCs w:val="32"/>
-        </w:rPr>
-      </w:pPr>
-      <w:r>
-        <w:rPr>
-          <w:b/>
-          <w:bCs/>
-          <w:sz w:val="32"/>
-          <w:szCs w:val="32"/>
+          <w:sz w:val="36"/>
+          <w:szCs w:val="36"/>
+        </w:rPr>
+      </w:pPr>
+      <w:r>
+        <w:rPr>
+          <w:b/>
+          <w:bCs/>
+          <w:sz w:val="36"/>
+          <w:szCs w:val="36"/>
+        </w:rPr>
+        <w:br w:type="page"/>
+      </w:r>
+    </w:p>
+    <w:p>
+      <w:pPr>
+        <w:rPr>
+          <w:b/>
+          <w:bCs/>
+          <w:sz w:val="36"/>
+          <w:szCs w:val="36"/>
+        </w:rPr>
+      </w:pPr>
+      <w:r>
+        <w:rPr>
+          <w:b/>
+          <w:bCs/>
+          <w:sz w:val="36"/>
+          <w:szCs w:val="36"/>
         </w:rPr>
         <w:lastRenderedPageBreak/>
-        <w:t>Uraniborg elevation</w:t>
+        <w:t xml:space="preserve">Uraniborg </w:t>
+      </w:r>
+      <w:r>
+        <w:rPr>
+          <w:b/>
+          <w:bCs/>
+          <w:sz w:val="36"/>
+          <w:szCs w:val="36"/>
+        </w:rPr>
+        <w:t>*</w:t>
       </w:r>
     </w:p>
     <w:p>
@@ -2695,6 +2784,21 @@
           <w:sz w:val="28"/>
           <w:szCs w:val="28"/>
         </w:rPr>
+        <w:t>Named after Urania, the Muse Of Astronomy</w:t>
+      </w:r>
+    </w:p>
+    <w:p>
+      <w:pPr>
+        <w:rPr>
+          <w:sz w:val="28"/>
+          <w:szCs w:val="28"/>
+        </w:rPr>
+      </w:pPr>
+      <w:r>
+        <w:rPr>
+          <w:sz w:val="28"/>
+          <w:szCs w:val="28"/>
+        </w:rPr>
         <w:t>Very elaborate and symmetrical. Fine example of late Flemish Renaissance</w:t>
       </w:r>
     </w:p>
@@ -3114,6 +3218,7 @@
           <w:sz w:val="30"/>
           <w:szCs w:val="30"/>
         </w:rPr>
+        <w:lastRenderedPageBreak/>
         <w:t>Central tower: accessed from spiral staircase – highest vantage point</w:t>
       </w:r>
     </w:p>
@@ -3133,7 +3238,6 @@
           <w:sz w:val="36"/>
           <w:szCs w:val="36"/>
         </w:rPr>
-        <w:lastRenderedPageBreak/>
         <w:t>Uraniborg &amp; gardens</w:t>
       </w:r>
     </w:p>
@@ -3409,6 +3513,7 @@
           <w:sz w:val="32"/>
           <w:szCs w:val="32"/>
         </w:rPr>
+        <w:lastRenderedPageBreak/>
         <w:t>A Danish architect and a sculptor, respectively, who oversaw the erection of the site</w:t>
       </w:r>
     </w:p>
@@ -3424,7 +3529,6 @@
           <w:sz w:val="44"/>
           <w:szCs w:val="44"/>
         </w:rPr>
-        <w:lastRenderedPageBreak/>
         <w:t xml:space="preserve">Far more than an observatory, Uraniborg was a synthesis of Tycho’s obsessions: </w:t>
       </w:r>
       <w:r>
@@ -3698,6 +3802,15 @@
         <w:lastRenderedPageBreak/>
         <w:t>The Sextant</w:t>
       </w:r>
+      <w:r>
+        <w:rPr>
+          <w:b/>
+          <w:bCs/>
+          <w:sz w:val="36"/>
+          <w:szCs w:val="36"/>
+        </w:rPr>
+        <w:t xml:space="preserve"> *</w:t>
+      </w:r>
     </w:p>
     <w:p>
       <w:pPr>
@@ -3849,6 +3962,15 @@
         <w:lastRenderedPageBreak/>
         <w:t>Zodiacal armillary Sphere</w:t>
       </w:r>
+      <w:r>
+        <w:rPr>
+          <w:b/>
+          <w:bCs/>
+          <w:sz w:val="36"/>
+          <w:szCs w:val="36"/>
+        </w:rPr>
+        <w:t xml:space="preserve"> *</w:t>
+      </w:r>
     </w:p>
     <w:p>
       <w:pPr>
@@ -4008,6 +4130,15 @@
         <w:lastRenderedPageBreak/>
         <w:t>Mural Quadrant</w:t>
       </w:r>
+      <w:r>
+        <w:rPr>
+          <w:b/>
+          <w:bCs/>
+          <w:sz w:val="32"/>
+          <w:szCs w:val="32"/>
+        </w:rPr>
+        <w:t xml:space="preserve"> *</w:t>
+      </w:r>
     </w:p>
     <w:p>
       <w:pPr>
@@ -4401,6 +4532,15 @@
         </w:rPr>
         <w:t>Large brass globe</w:t>
       </w:r>
+      <w:r>
+        <w:rPr>
+          <w:b/>
+          <w:bCs/>
+          <w:sz w:val="32"/>
+          <w:szCs w:val="32"/>
+        </w:rPr>
+        <w:t xml:space="preserve"> *</w:t>
+      </w:r>
     </w:p>
     <w:p>
       <w:pPr>
@@ -4662,123 +4802,21 @@
     </w:p>
     <w:p>
       <w:pPr>
-        <w:numPr>
-          <w:ilvl w:val="0"/>
-          <w:numId w:val="19"/>
-        </w:numPr>
-        <w:rPr>
-          <w:b/>
-          <w:bCs/>
-          <w:sz w:val="32"/>
-          <w:szCs w:val="32"/>
-        </w:rPr>
-      </w:pPr>
-      <w:r>
-        <w:rPr>
-          <w:sz w:val="32"/>
-          <w:szCs w:val="32"/>
+        <w:rPr>
+          <w:b/>
+          <w:bCs/>
+          <w:sz w:val="36"/>
+          <w:szCs w:val="36"/>
+        </w:rPr>
+      </w:pPr>
+      <w:r>
+        <w:rPr>
+          <w:b/>
+          <w:bCs/>
+          <w:sz w:val="36"/>
+          <w:szCs w:val="36"/>
         </w:rPr>
         <w:lastRenderedPageBreak/>
-        <w:t>Many people from various countries travelled to Denmark in order to see this globe and my other instruments while the kingdom of Urania and the magnificent castle were still safe.</w:t>
-      </w:r>
-      <w:r>
-        <w:rPr>
-          <w:b/>
-          <w:bCs/>
-          <w:sz w:val="32"/>
-          <w:szCs w:val="32"/>
-        </w:rPr>
-        <w:t xml:space="preserve"> </w:t>
-      </w:r>
-    </w:p>
-    <w:p>
-      <w:pPr>
-        <w:rPr>
-          <w:b/>
-          <w:bCs/>
-          <w:sz w:val="32"/>
-          <w:szCs w:val="32"/>
-        </w:rPr>
-      </w:pPr>
-    </w:p>
-    <w:p>
-      <w:pPr>
-        <w:rPr>
-          <w:sz w:val="36"/>
-          <w:szCs w:val="36"/>
-        </w:rPr>
-      </w:pPr>
-      <w:r>
-        <w:rPr>
-          <w:sz w:val="36"/>
-          <w:szCs w:val="36"/>
-        </w:rPr>
-        <w:br w:type="page"/>
-      </w:r>
-    </w:p>
-    <w:p>
-      <w:pPr>
-        <w:rPr>
-          <w:b/>
-          <w:bCs/>
-          <w:sz w:val="36"/>
-          <w:szCs w:val="36"/>
-        </w:rPr>
-      </w:pPr>
-      <w:r>
-        <w:rPr>
-          <w:b/>
-          <w:bCs/>
-          <w:sz w:val="36"/>
-          <w:szCs w:val="36"/>
-        </w:rPr>
-        <w:lastRenderedPageBreak/>
-        <w:t>Improvements</w:t>
-      </w:r>
-    </w:p>
-    <w:p>
-      <w:pPr>
-        <w:rPr>
-          <w:b/>
-          <w:bCs/>
-          <w:sz w:val="36"/>
-          <w:szCs w:val="36"/>
-        </w:rPr>
-      </w:pPr>
-      <w:r>
-        <w:rPr>
-          <w:b/>
-          <w:bCs/>
-          <w:sz w:val="36"/>
-          <w:szCs w:val="36"/>
-        </w:rPr>
-        <w:t>Traversal points</w:t>
-      </w:r>
-    </w:p>
-    <w:p>
-      <w:pPr>
-        <w:rPr>
-          <w:sz w:val="36"/>
-          <w:szCs w:val="36"/>
-        </w:rPr>
-      </w:pPr>
-    </w:p>
-    <w:p>
-      <w:pPr>
-        <w:rPr>
-          <w:b/>
-          <w:bCs/>
-          <w:sz w:val="36"/>
-          <w:szCs w:val="36"/>
-        </w:rPr>
-      </w:pPr>
-      <w:r>
-        <w:rPr>
-          <w:b/>
-          <w:bCs/>
-          <w:sz w:val="36"/>
-          <w:szCs w:val="36"/>
-        </w:rPr>
         <w:t>Adilade – parallel sightings</w:t>
       </w:r>
     </w:p>
@@ -5310,7 +5348,36 @@
           <w:sz w:val="36"/>
           <w:szCs w:val="36"/>
         </w:rPr>
+        <w:br w:type="page"/>
+      </w:r>
+    </w:p>
+    <w:p>
+      <w:pPr>
+        <w:rPr>
+          <w:b/>
+          <w:bCs/>
+          <w:sz w:val="36"/>
+          <w:szCs w:val="36"/>
+        </w:rPr>
+      </w:pPr>
+      <w:r>
+        <w:rPr>
+          <w:b/>
+          <w:bCs/>
+          <w:sz w:val="36"/>
+          <w:szCs w:val="36"/>
+        </w:rPr>
+        <w:lastRenderedPageBreak/>
         <w:t>Stjerneborg</w:t>
+      </w:r>
+      <w:r>
+        <w:rPr>
+          <w:b/>
+          <w:bCs/>
+          <w:sz w:val="36"/>
+          <w:szCs w:val="36"/>
+        </w:rPr>
+        <w:t xml:space="preserve"> *</w:t>
       </w:r>
     </w:p>
     <w:p>
@@ -5507,6 +5574,25 @@
           <w:sz w:val="36"/>
           <w:szCs w:val="36"/>
         </w:rPr>
+        <w:br w:type="page"/>
+      </w:r>
+    </w:p>
+    <w:p>
+      <w:pPr>
+        <w:rPr>
+          <w:b/>
+          <w:bCs/>
+          <w:sz w:val="36"/>
+          <w:szCs w:val="36"/>
+        </w:rPr>
+      </w:pPr>
+      <w:r>
+        <w:rPr>
+          <w:b/>
+          <w:bCs/>
+          <w:sz w:val="36"/>
+          <w:szCs w:val="36"/>
+        </w:rPr>
         <w:lastRenderedPageBreak/>
         <w:t>Exile</w:t>
       </w:r>
@@ -6719,6 +6805,158 @@
     </w:p>
     <w:p>
       <w:pPr>
+        <w:rPr>
+          <w:b/>
+          <w:bCs/>
+          <w:sz w:val="32"/>
+          <w:szCs w:val="32"/>
+        </w:rPr>
+      </w:pPr>
+      <w:r>
+        <w:rPr>
+          <w:b/>
+          <w:bCs/>
+          <w:sz w:val="32"/>
+          <w:szCs w:val="32"/>
+        </w:rPr>
+        <w:lastRenderedPageBreak/>
+        <w:t>Death</w:t>
+      </w:r>
+      <w:r>
+        <w:rPr>
+          <w:b/>
+          <w:bCs/>
+          <w:sz w:val="32"/>
+          <w:szCs w:val="32"/>
+        </w:rPr>
+        <w:t xml:space="preserve"> *</w:t>
+      </w:r>
+    </w:p>
+    <w:p>
+      <w:pPr>
+        <w:pStyle w:val="ListParagraph"/>
+        <w:numPr>
+          <w:ilvl w:val="0"/>
+          <w:numId w:val="32"/>
+        </w:numPr>
+        <w:rPr>
+          <w:sz w:val="32"/>
+          <w:szCs w:val="32"/>
+        </w:rPr>
+      </w:pPr>
+      <w:r>
+        <w:rPr>
+          <w:sz w:val="32"/>
+          <w:szCs w:val="32"/>
+        </w:rPr>
+        <w:t>13</w:t>
+      </w:r>
+      <w:r>
+        <w:rPr>
+          <w:sz w:val="32"/>
+          <w:szCs w:val="32"/>
+          <w:vertAlign w:val="superscript"/>
+        </w:rPr>
+        <w:t>th</w:t>
+      </w:r>
+      <w:r>
+        <w:rPr>
+          <w:sz w:val="32"/>
+          <w:szCs w:val="32"/>
+        </w:rPr>
+        <w:t xml:space="preserve"> Oct 1601:</w:t>
+      </w:r>
+    </w:p>
+    <w:p>
+      <w:pPr>
+        <w:pStyle w:val="ListParagraph"/>
+        <w:numPr>
+          <w:ilvl w:val="1"/>
+          <w:numId w:val="28"/>
+        </w:numPr>
+        <w:rPr>
+          <w:sz w:val="32"/>
+          <w:szCs w:val="32"/>
+        </w:rPr>
+      </w:pPr>
+      <w:r>
+        <w:rPr>
+          <w:sz w:val="32"/>
+          <w:szCs w:val="32"/>
+        </w:rPr>
+        <w:t xml:space="preserve">Tycho dines with Baron Ehrenfried von Minckwitz at the palace of Peter Vok von Rosenburg </w:t>
+      </w:r>
+    </w:p>
+    <w:p>
+      <w:pPr>
+        <w:pStyle w:val="ListParagraph"/>
+        <w:numPr>
+          <w:ilvl w:val="1"/>
+          <w:numId w:val="28"/>
+        </w:numPr>
+        <w:rPr>
+          <w:sz w:val="32"/>
+          <w:szCs w:val="32"/>
+        </w:rPr>
+      </w:pPr>
+      <w:r>
+        <w:rPr>
+          <w:sz w:val="32"/>
+          <w:szCs w:val="32"/>
+        </w:rPr>
+        <w:t>After a vast amount of food and drink during which Tycho needed to excuse himself, but etiquette prevented him from leaving the table</w:t>
+      </w:r>
+    </w:p>
+    <w:p>
+      <w:pPr>
+        <w:pStyle w:val="ListParagraph"/>
+        <w:numPr>
+          <w:ilvl w:val="1"/>
+          <w:numId w:val="28"/>
+        </w:numPr>
+        <w:rPr>
+          <w:sz w:val="32"/>
+          <w:szCs w:val="32"/>
+        </w:rPr>
+      </w:pPr>
+      <w:r>
+        <w:rPr>
+          <w:sz w:val="32"/>
+          <w:szCs w:val="32"/>
+        </w:rPr>
+        <w:t>When he returned home, he could not pass water, and was in agony</w:t>
+      </w:r>
+    </w:p>
+    <w:p>
+      <w:pPr>
+        <w:pStyle w:val="ListParagraph"/>
+        <w:numPr>
+          <w:ilvl w:val="1"/>
+          <w:numId w:val="28"/>
+        </w:numPr>
+        <w:rPr>
+          <w:sz w:val="32"/>
+          <w:szCs w:val="32"/>
+        </w:rPr>
+      </w:pPr>
+      <w:r>
+        <w:rPr>
+          <w:sz w:val="32"/>
+          <w:szCs w:val="32"/>
+        </w:rPr>
+        <w:t>Agony continues for 5 days and nights</w:t>
+      </w:r>
+    </w:p>
+    <w:p>
+      <w:pPr>
+        <w:rPr>
+          <w:sz w:val="32"/>
+          <w:szCs w:val="32"/>
+        </w:rPr>
+      </w:pPr>
+    </w:p>
+    <w:p>
+      <w:pPr>
         <w:pStyle w:val="ListParagraph"/>
         <w:numPr>
           <w:ilvl w:val="0"/>
@@ -6734,8 +6972,7 @@
           <w:sz w:val="32"/>
           <w:szCs w:val="32"/>
         </w:rPr>
-        <w:lastRenderedPageBreak/>
-        <w:t>13</w:t>
+        <w:t>20</w:t>
       </w:r>
       <w:r>
         <w:rPr>
@@ -6770,7 +7007,7 @@
           <w:sz w:val="32"/>
           <w:szCs w:val="32"/>
         </w:rPr>
-        <w:t xml:space="preserve">Tycho dines with Baron Ehrenfried von Minckwitz at the palace of Peter Vok von Rosenburg </w:t>
+        <w:t>Tycho rallies and eats with Count Erik Brahe of Visingborg</w:t>
       </w:r>
     </w:p>
     <w:p>
@@ -6785,12 +7022,40 @@
           <w:szCs w:val="32"/>
         </w:rPr>
       </w:pPr>
-      <w:r>
-        <w:rPr>
-          <w:sz w:val="32"/>
-          <w:szCs w:val="32"/>
-        </w:rPr>
-        <w:t>After a vast amount of food and drink during which Tycho needed to excuse himself, but etiquette prevented him from leaving the table</w:t>
+    </w:p>
+    <w:p>
+      <w:pPr>
+        <w:pStyle w:val="ListParagraph"/>
+        <w:numPr>
+          <w:ilvl w:val="0"/>
+          <w:numId w:val="28"/>
+        </w:numPr>
+        <w:rPr>
+          <w:sz w:val="32"/>
+          <w:szCs w:val="32"/>
+        </w:rPr>
+      </w:pPr>
+      <w:r>
+        <w:rPr>
+          <w:sz w:val="32"/>
+          <w:szCs w:val="32"/>
+        </w:rPr>
+        <w:t>Night of 23</w:t>
+      </w:r>
+      <w:r>
+        <w:rPr>
+          <w:sz w:val="32"/>
+          <w:szCs w:val="32"/>
+          <w:vertAlign w:val="superscript"/>
+        </w:rPr>
+        <w:t>th</w:t>
+      </w:r>
+      <w:r>
+        <w:rPr>
+          <w:sz w:val="32"/>
+          <w:szCs w:val="32"/>
+        </w:rPr>
+        <w:t xml:space="preserve"> Oct 1601:</w:t>
       </w:r>
     </w:p>
     <w:p>
@@ -6810,7 +7075,7 @@
           <w:sz w:val="32"/>
           <w:szCs w:val="32"/>
         </w:rPr>
-        <w:t>When he returned home, he could not pass water, and was in agony</w:t>
+        <w:t>Tycho delirious all night long</w:t>
       </w:r>
     </w:p>
     <w:p>
@@ -6830,11 +7095,48 @@
           <w:sz w:val="32"/>
           <w:szCs w:val="32"/>
         </w:rPr>
-        <w:t>Agony continues for 5 days and nights</w:t>
-      </w:r>
-    </w:p>
-    <w:p>
-      <w:pPr>
+        <w:t>Softly repeated the phrase ‘</w:t>
+      </w:r>
+      <w:r>
+        <w:rPr>
+          <w:i/>
+          <w:iCs/>
+          <w:sz w:val="32"/>
+          <w:szCs w:val="32"/>
+        </w:rPr>
+        <w:t>Ne frustra vixisse videar</w:t>
+      </w:r>
+      <w:r>
+        <w:rPr>
+          <w:sz w:val="32"/>
+          <w:szCs w:val="32"/>
+        </w:rPr>
+        <w:t>’ – ‘</w:t>
+      </w:r>
+      <w:r>
+        <w:rPr>
+          <w:i/>
+          <w:iCs/>
+          <w:sz w:val="32"/>
+          <w:szCs w:val="32"/>
+        </w:rPr>
+        <w:t>let me not have died in vain</w:t>
+      </w:r>
+      <w:r>
+        <w:rPr>
+          <w:sz w:val="32"/>
+          <w:szCs w:val="32"/>
+        </w:rPr>
+        <w:t>’ over and over</w:t>
+      </w:r>
+    </w:p>
+    <w:p>
+      <w:pPr>
+        <w:pStyle w:val="ListParagraph"/>
+        <w:numPr>
+          <w:ilvl w:val="1"/>
+          <w:numId w:val="28"/>
+        </w:numPr>
         <w:rPr>
           <w:sz w:val="32"/>
           <w:szCs w:val="32"/>
@@ -6858,7 +7160,7 @@
           <w:sz w:val="32"/>
           <w:szCs w:val="32"/>
         </w:rPr>
-        <w:t>20</w:t>
+        <w:t>9pm on 24</w:t>
       </w:r>
       <w:r>
         <w:rPr>
@@ -6893,7 +7195,95 @@
           <w:sz w:val="32"/>
           <w:szCs w:val="32"/>
         </w:rPr>
-        <w:t>Tycho rallies and eats with Count Erik Brahe of Visingborg</w:t>
+        <w:t>Tycho dies in the arms of Erik Brahe</w:t>
+      </w:r>
+    </w:p>
+    <w:p>
+      <w:pPr>
+        <w:pStyle w:val="ListParagraph"/>
+        <w:numPr>
+          <w:ilvl w:val="1"/>
+          <w:numId w:val="28"/>
+        </w:numPr>
+        <w:rPr>
+          <w:sz w:val="32"/>
+          <w:szCs w:val="32"/>
+        </w:rPr>
+      </w:pPr>
+      <w:r>
+        <w:rPr>
+          <w:sz w:val="32"/>
+          <w:szCs w:val="32"/>
+        </w:rPr>
+        <w:t>Kepler states later: ‘I saw the greatest of men expire’</w:t>
+      </w:r>
+    </w:p>
+    <w:p>
+      <w:pPr>
+        <w:pStyle w:val="ListParagraph"/>
+        <w:numPr>
+          <w:ilvl w:val="1"/>
+          <w:numId w:val="28"/>
+        </w:numPr>
+        <w:rPr>
+          <w:sz w:val="32"/>
+          <w:szCs w:val="32"/>
+        </w:rPr>
+      </w:pPr>
+      <w:r>
+        <w:rPr>
+          <w:sz w:val="32"/>
+          <w:szCs w:val="32"/>
+        </w:rPr>
+        <w:t>Kepler provides a moving account of Tycho’s death as the last entry in the observational journal</w:t>
+      </w:r>
+    </w:p>
+    <w:p>
+      <w:pPr>
+        <w:rPr>
+          <w:b/>
+          <w:bCs/>
+          <w:sz w:val="32"/>
+          <w:szCs w:val="32"/>
+        </w:rPr>
+      </w:pPr>
+      <w:r>
+        <w:rPr>
+          <w:b/>
+          <w:bCs/>
+          <w:sz w:val="32"/>
+          <w:szCs w:val="32"/>
+        </w:rPr>
+        <w:br w:type="page"/>
+      </w:r>
+    </w:p>
+    <w:p>
+      <w:pPr>
+        <w:rPr>
+          <w:b/>
+          <w:bCs/>
+          <w:sz w:val="32"/>
+          <w:szCs w:val="32"/>
+        </w:rPr>
+      </w:pPr>
+      <w:r>
+        <w:rPr>
+          <w:b/>
+          <w:bCs/>
+          <w:sz w:val="32"/>
+          <w:szCs w:val="32"/>
+        </w:rPr>
+        <w:lastRenderedPageBreak/>
+        <w:t>Achievements</w:t>
+      </w:r>
+      <w:r>
+        <w:rPr>
+          <w:b/>
+          <w:bCs/>
+          <w:sz w:val="32"/>
+          <w:szCs w:val="32"/>
+        </w:rPr>
+        <w:t xml:space="preserve"> *</w:t>
       </w:r>
     </w:p>
     <w:p>
@@ -6913,29 +7303,23 @@
           <w:sz w:val="32"/>
           <w:szCs w:val="32"/>
         </w:rPr>
-        <w:t>Night of 23</w:t>
-      </w:r>
-      <w:r>
-        <w:rPr>
-          <w:sz w:val="32"/>
-          <w:szCs w:val="32"/>
-          <w:vertAlign w:val="superscript"/>
-        </w:rPr>
-        <w:t>th</w:t>
-      </w:r>
-      <w:r>
-        <w:rPr>
-          <w:sz w:val="32"/>
-          <w:szCs w:val="32"/>
-        </w:rPr>
-        <w:t xml:space="preserve"> Oct 1601:</w:t>
-      </w:r>
-    </w:p>
-    <w:p>
-      <w:pPr>
-        <w:pStyle w:val="ListParagraph"/>
-        <w:numPr>
-          <w:ilvl w:val="1"/>
+        <w:t>Tycho Brahe life’s work was the ‘restoration’ of astronomy: to observe the stars and planets with the highest possible precision that was humanly possible, so that we might understand the universe and its workings better</w:t>
+      </w:r>
+    </w:p>
+    <w:p>
+      <w:pPr>
+        <w:pStyle w:val="ListParagraph"/>
+        <w:rPr>
+          <w:sz w:val="32"/>
+          <w:szCs w:val="32"/>
+        </w:rPr>
+      </w:pPr>
+    </w:p>
+    <w:p>
+      <w:pPr>
+        <w:pStyle w:val="ListParagraph"/>
+        <w:numPr>
+          <w:ilvl w:val="0"/>
           <w:numId w:val="28"/>
         </w:numPr>
         <w:rPr>
@@ -6948,14 +7332,23 @@
           <w:sz w:val="32"/>
           <w:szCs w:val="32"/>
         </w:rPr>
-        <w:t>Tycho delirious all night long</w:t>
-      </w:r>
-    </w:p>
-    <w:p>
-      <w:pPr>
-        <w:pStyle w:val="ListParagraph"/>
-        <w:numPr>
-          <w:ilvl w:val="1"/>
+        <w:t>Rawlins (1993) states that ‘Tycho Brahe’s … “Thousand Star Catalog” published in 1598 … was one of history’s outstanding attempts at mass-perfectionism … it is of far greater magnificence than is now generally realised. In it Tycho realised, on a mass scale, a precision far greater than earlier catalogues. It represents an unprecedented confluence of skills: instrumental, observational and computational, all of which combined to enable Tycho to place most of the hundreds of recorded stars to an accuracy of 1 arcmin” (1/60th of a degree).</w:t>
+      </w:r>
+    </w:p>
+    <w:p>
+      <w:pPr>
+        <w:pStyle w:val="ListParagraph"/>
+        <w:rPr>
+          <w:sz w:val="32"/>
+          <w:szCs w:val="32"/>
+        </w:rPr>
+      </w:pPr>
+    </w:p>
+    <w:p>
+      <w:pPr>
+        <w:pStyle w:val="ListParagraph"/>
+        <w:numPr>
+          <w:ilvl w:val="0"/>
           <w:numId w:val="28"/>
         </w:numPr>
         <w:rPr>
@@ -6968,563 +7361,296 @@
           <w:sz w:val="32"/>
           <w:szCs w:val="32"/>
         </w:rPr>
-        <w:t>Softly repeated the phrase ‘</w:t>
-      </w:r>
-      <w:r>
-        <w:rPr>
+        <w:t>Not ‘merely’ an observer</w:t>
+      </w:r>
+      <w:r>
+        <w:rPr>
+          <w:sz w:val="32"/>
+          <w:szCs w:val="32"/>
+        </w:rPr>
+        <w:t xml:space="preserve">, but </w:t>
+      </w:r>
+      <w:r>
+        <w:rPr>
+          <w:sz w:val="32"/>
+          <w:szCs w:val="32"/>
+        </w:rPr>
+        <w:t xml:space="preserve">also thought deeply about how the universe worked. </w:t>
+      </w:r>
+    </w:p>
+    <w:p>
+      <w:pPr>
+        <w:pStyle w:val="ListParagraph"/>
+        <w:rPr>
+          <w:sz w:val="32"/>
+          <w:szCs w:val="32"/>
+        </w:rPr>
+      </w:pPr>
+    </w:p>
+    <w:p>
+      <w:pPr>
+        <w:pStyle w:val="ListParagraph"/>
+        <w:numPr>
+          <w:ilvl w:val="0"/>
+          <w:numId w:val="28"/>
+        </w:numPr>
+        <w:rPr>
+          <w:sz w:val="32"/>
+          <w:szCs w:val="32"/>
+        </w:rPr>
+      </w:pPr>
+      <w:r>
+        <w:rPr>
+          <w:sz w:val="32"/>
+          <w:szCs w:val="32"/>
+        </w:rPr>
+        <w:t>He had his own theory of the Solar System and of the motions of the Moon.</w:t>
+      </w:r>
+    </w:p>
+    <w:p>
+      <w:pPr>
+        <w:pStyle w:val="ListParagraph"/>
+        <w:rPr>
+          <w:sz w:val="32"/>
+          <w:szCs w:val="32"/>
+        </w:rPr>
+      </w:pPr>
+    </w:p>
+    <w:p>
+      <w:pPr>
+        <w:pStyle w:val="ListParagraph"/>
+        <w:numPr>
+          <w:ilvl w:val="0"/>
+          <w:numId w:val="28"/>
+        </w:numPr>
+        <w:rPr>
+          <w:sz w:val="32"/>
+          <w:szCs w:val="32"/>
+        </w:rPr>
+      </w:pPr>
+      <w:r>
+        <w:rPr>
+          <w:sz w:val="32"/>
+          <w:szCs w:val="32"/>
+        </w:rPr>
+        <w:t xml:space="preserve">And he made several important discoveries. From his observations of the new star of 1572 and several comets he demolished the Aristotelian views that there could be no change in the heavens farther than the Moon and that the planets were carried along in their orbits by perfect crystalline spheres. </w:t>
+      </w:r>
+    </w:p>
+    <w:p>
+      <w:pPr>
+        <w:pStyle w:val="ListParagraph"/>
+        <w:rPr>
+          <w:sz w:val="32"/>
+          <w:szCs w:val="32"/>
+        </w:rPr>
+      </w:pPr>
+    </w:p>
+    <w:p>
+      <w:pPr>
+        <w:pStyle w:val="ListParagraph"/>
+        <w:numPr>
+          <w:ilvl w:val="0"/>
+          <w:numId w:val="28"/>
+        </w:numPr>
+        <w:rPr>
+          <w:sz w:val="32"/>
+          <w:szCs w:val="32"/>
+        </w:rPr>
+      </w:pPr>
+      <w:r>
+        <w:rPr>
+          <w:sz w:val="32"/>
+          <w:szCs w:val="32"/>
+        </w:rPr>
+        <w:lastRenderedPageBreak/>
+        <w:t>He was the first to realise that the tail of a comet always points away from the Sun, and that the direction of the Moon’s axis changes over time (nutation).</w:t>
+      </w:r>
+    </w:p>
+    <w:p>
+      <w:pPr>
+        <w:pStyle w:val="ListParagraph"/>
+        <w:rPr>
+          <w:sz w:val="32"/>
+          <w:szCs w:val="32"/>
+        </w:rPr>
+      </w:pPr>
+    </w:p>
+    <w:p>
+      <w:pPr>
+        <w:pStyle w:val="ListParagraph"/>
+        <w:numPr>
+          <w:ilvl w:val="0"/>
+          <w:numId w:val="28"/>
+        </w:numPr>
+        <w:rPr>
+          <w:sz w:val="32"/>
+          <w:szCs w:val="32"/>
+        </w:rPr>
+      </w:pPr>
+      <w:r>
+        <w:rPr>
+          <w:sz w:val="32"/>
+          <w:szCs w:val="32"/>
+        </w:rPr>
+        <w:t>Tycho made enormous strides in scientific instrumentation</w:t>
+      </w:r>
+      <w:r>
+        <w:rPr>
+          <w:sz w:val="32"/>
+          <w:szCs w:val="32"/>
+        </w:rPr>
+        <w:t xml:space="preserve">. </w:t>
+      </w:r>
+    </w:p>
+    <w:p>
+      <w:pPr>
+        <w:pStyle w:val="ListParagraph"/>
+        <w:rPr>
+          <w:sz w:val="32"/>
+          <w:szCs w:val="32"/>
+        </w:rPr>
+      </w:pPr>
+    </w:p>
+    <w:p>
+      <w:pPr>
+        <w:pStyle w:val="ListParagraph"/>
+        <w:numPr>
+          <w:ilvl w:val="0"/>
+          <w:numId w:val="28"/>
+        </w:numPr>
+        <w:rPr>
+          <w:sz w:val="32"/>
+          <w:szCs w:val="32"/>
+        </w:rPr>
+      </w:pPr>
+      <w:r>
+        <w:rPr>
+          <w:sz w:val="32"/>
+          <w:szCs w:val="32"/>
+        </w:rPr>
+        <w:t>He was the first person to understand the importance of taking multiple measurements</w:t>
+      </w:r>
+      <w:r>
+        <w:rPr>
+          <w:sz w:val="32"/>
+          <w:szCs w:val="32"/>
+        </w:rPr>
+        <w:t xml:space="preserve"> </w:t>
+      </w:r>
+      <w:r>
+        <w:rPr>
+          <w:sz w:val="32"/>
+          <w:szCs w:val="32"/>
+        </w:rPr>
+        <w:t>whereas previously</w:t>
+      </w:r>
+      <w:r>
+        <w:rPr>
+          <w:sz w:val="32"/>
+          <w:szCs w:val="32"/>
+        </w:rPr>
+        <w:t xml:space="preserve"> a single measurement was considered to be definitive. He was</w:t>
+      </w:r>
+      <w:r>
+        <w:rPr>
+          <w:sz w:val="32"/>
+          <w:szCs w:val="32"/>
+        </w:rPr>
+        <w:t xml:space="preserve"> the first to understand the role of measurement error, and invented techniques to reduce his data that are still used today. These are so fundamental to modern science that we take them for granted. Yet before Tycho they were unheard of.</w:t>
+      </w:r>
+    </w:p>
+    <w:p>
+      <w:pPr>
+        <w:pStyle w:val="ListParagraph"/>
+        <w:rPr>
+          <w:sz w:val="32"/>
+          <w:szCs w:val="32"/>
+        </w:rPr>
+      </w:pPr>
+    </w:p>
+    <w:p>
+      <w:pPr>
+        <w:pStyle w:val="ListParagraph"/>
+        <w:numPr>
+          <w:ilvl w:val="0"/>
+          <w:numId w:val="28"/>
+        </w:numPr>
+        <w:rPr>
+          <w:sz w:val="32"/>
+          <w:szCs w:val="32"/>
+        </w:rPr>
+      </w:pPr>
+      <w:r>
+        <w:rPr>
+          <w:sz w:val="32"/>
+          <w:szCs w:val="32"/>
+        </w:rPr>
+        <w:t>Perhaps most impressive was Tycho’s enormous capacity for bringing to bear the diverse talents of so many people to the realisation of his life’s work, and over such a long period (1574–1601). In so doing, Tycho created the world’s first research institute: Uraniborg, and the model for ’Big Science’ which he effectively invented.</w:t>
+      </w:r>
+    </w:p>
+    <w:p>
+      <w:pPr>
+        <w:pStyle w:val="ListParagraph"/>
+        <w:rPr>
+          <w:sz w:val="32"/>
+          <w:szCs w:val="32"/>
+        </w:rPr>
+      </w:pPr>
+    </w:p>
+    <w:p>
+      <w:pPr>
+        <w:pStyle w:val="ListParagraph"/>
+        <w:numPr>
+          <w:ilvl w:val="0"/>
+          <w:numId w:val="28"/>
+        </w:numPr>
+        <w:rPr>
+          <w:sz w:val="32"/>
+          <w:szCs w:val="32"/>
+        </w:rPr>
+      </w:pPr>
+      <w:r>
+        <w:rPr>
+          <w:sz w:val="32"/>
+          <w:szCs w:val="32"/>
+        </w:rPr>
+        <w:t>Tycho was fond of writing inscriptions which were dotted all over Uraniborg. Perhaps this one is the most appropriate with which to end:</w:t>
+      </w:r>
+    </w:p>
+    <w:p>
+      <w:pPr>
+        <w:pStyle w:val="ListParagraph"/>
+        <w:rPr>
+          <w:sz w:val="32"/>
+          <w:szCs w:val="32"/>
+        </w:rPr>
+      </w:pPr>
+    </w:p>
+    <w:p>
+      <w:pPr>
+        <w:pStyle w:val="ListParagraph"/>
+        <w:numPr>
+          <w:ilvl w:val="0"/>
+          <w:numId w:val="28"/>
+        </w:numPr>
+        <w:rPr>
+          <w:b/>
+          <w:bCs/>
           <w:i/>
           <w:iCs/>
           <w:sz w:val="32"/>
           <w:szCs w:val="32"/>
         </w:rPr>
-        <w:t>Ne frustra vixisse videar</w:t>
-      </w:r>
-      <w:r>
-        <w:rPr>
-          <w:sz w:val="32"/>
-          <w:szCs w:val="32"/>
-        </w:rPr>
-        <w:t>’ – ‘</w:t>
-      </w:r>
-      <w:r>
-        <w:rPr>
+      </w:pPr>
+      <w:r>
+        <w:rPr>
+          <w:b/>
+          <w:bCs/>
           <w:i/>
           <w:iCs/>
           <w:sz w:val="32"/>
           <w:szCs w:val="32"/>
         </w:rPr>
-        <w:t>let me not have died in vain</w:t>
-      </w:r>
-      <w:r>
-        <w:rPr>
-          <w:sz w:val="32"/>
-          <w:szCs w:val="32"/>
-        </w:rPr>
-        <w:t>’ over and over</w:t>
-      </w:r>
-    </w:p>
-    <w:p>
-      <w:pPr>
-        <w:pStyle w:val="ListParagraph"/>
-        <w:numPr>
-          <w:ilvl w:val="0"/>
-          <w:numId w:val="28"/>
-        </w:numPr>
-        <w:rPr>
-          <w:sz w:val="32"/>
-          <w:szCs w:val="32"/>
-        </w:rPr>
-      </w:pPr>
-      <w:r>
-        <w:rPr>
-          <w:sz w:val="32"/>
-          <w:szCs w:val="32"/>
-        </w:rPr>
-        <w:t>9pm on 24</w:t>
-      </w:r>
-      <w:r>
-        <w:rPr>
-          <w:sz w:val="32"/>
-          <w:szCs w:val="32"/>
-          <w:vertAlign w:val="superscript"/>
-        </w:rPr>
-        <w:t>th</w:t>
-      </w:r>
-      <w:r>
-        <w:rPr>
-          <w:sz w:val="32"/>
-          <w:szCs w:val="32"/>
-        </w:rPr>
-        <w:t xml:space="preserve"> Oct 1601:</w:t>
-      </w:r>
-    </w:p>
-    <w:p>
-      <w:pPr>
-        <w:pStyle w:val="ListParagraph"/>
-        <w:numPr>
-          <w:ilvl w:val="1"/>
-          <w:numId w:val="28"/>
-        </w:numPr>
-        <w:rPr>
-          <w:sz w:val="32"/>
-          <w:szCs w:val="32"/>
-        </w:rPr>
-      </w:pPr>
-      <w:r>
-        <w:rPr>
-          <w:sz w:val="32"/>
-          <w:szCs w:val="32"/>
-        </w:rPr>
-        <w:t>Tycho dies in the arms of Erik Brahe</w:t>
-      </w:r>
-    </w:p>
-    <w:p>
-      <w:pPr>
-        <w:pStyle w:val="ListParagraph"/>
-        <w:numPr>
-          <w:ilvl w:val="1"/>
-          <w:numId w:val="28"/>
-        </w:numPr>
-        <w:rPr>
-          <w:sz w:val="32"/>
-          <w:szCs w:val="32"/>
-        </w:rPr>
-      </w:pPr>
-      <w:r>
-        <w:rPr>
-          <w:sz w:val="32"/>
-          <w:szCs w:val="32"/>
-        </w:rPr>
-        <w:t>Kepler states later: ‘I saw the greatest of men expire’</w:t>
-      </w:r>
-    </w:p>
-    <w:p>
-      <w:pPr>
-        <w:pStyle w:val="ListParagraph"/>
-        <w:numPr>
-          <w:ilvl w:val="1"/>
-          <w:numId w:val="28"/>
-        </w:numPr>
-        <w:rPr>
-          <w:sz w:val="32"/>
-          <w:szCs w:val="32"/>
-        </w:rPr>
-      </w:pPr>
-      <w:r>
-        <w:rPr>
-          <w:sz w:val="32"/>
-          <w:szCs w:val="32"/>
-        </w:rPr>
-        <w:t>Kepler provides a moving account of Tycho’s death as the last entry in the observational journal</w:t>
-      </w:r>
-    </w:p>
-    <w:p>
-      <w:pPr>
-        <w:rPr>
-          <w:b/>
-          <w:bCs/>
-          <w:sz w:val="32"/>
-          <w:szCs w:val="32"/>
-        </w:rPr>
-      </w:pPr>
-      <w:r>
-        <w:rPr>
-          <w:b/>
-          <w:bCs/>
-          <w:sz w:val="32"/>
-          <w:szCs w:val="32"/>
-        </w:rPr>
-        <w:br w:type="page"/>
-      </w:r>
-    </w:p>
-    <w:p>
-      <w:pPr>
-        <w:rPr>
-          <w:b/>
-          <w:bCs/>
-          <w:sz w:val="32"/>
-          <w:szCs w:val="32"/>
-        </w:rPr>
-      </w:pPr>
-      <w:r>
-        <w:rPr>
-          <w:b/>
-          <w:bCs/>
-          <w:sz w:val="32"/>
-          <w:szCs w:val="32"/>
-        </w:rPr>
-        <w:lastRenderedPageBreak/>
-        <w:t>Achievements</w:t>
-      </w:r>
-    </w:p>
-    <w:p>
-      <w:pPr>
-        <w:pStyle w:val="ListParagraph"/>
-        <w:numPr>
-          <w:ilvl w:val="0"/>
-          <w:numId w:val="28"/>
-        </w:numPr>
-        <w:rPr>
-          <w:sz w:val="32"/>
-          <w:szCs w:val="32"/>
-        </w:rPr>
-      </w:pPr>
-      <w:r>
-        <w:rPr>
-          <w:sz w:val="32"/>
-          <w:szCs w:val="32"/>
-        </w:rPr>
-        <w:t>Tycho Brahe life’s work was the ‘restoration’ of astronomy: to observe the stars and planets with the highest possible precision that was humanly possible, so that we might understand the universe and its workings better</w:t>
-      </w:r>
-    </w:p>
-    <w:p>
-      <w:pPr>
-        <w:pStyle w:val="ListParagraph"/>
-        <w:rPr>
-          <w:sz w:val="32"/>
-          <w:szCs w:val="32"/>
-        </w:rPr>
-      </w:pPr>
-    </w:p>
-    <w:p>
-      <w:pPr>
-        <w:pStyle w:val="ListParagraph"/>
-        <w:numPr>
-          <w:ilvl w:val="0"/>
-          <w:numId w:val="28"/>
-        </w:numPr>
-        <w:rPr>
-          <w:sz w:val="32"/>
-          <w:szCs w:val="32"/>
-        </w:rPr>
-      </w:pPr>
-      <w:r>
-        <w:rPr>
-          <w:sz w:val="32"/>
-          <w:szCs w:val="32"/>
-        </w:rPr>
-        <w:t>There is no question that he achieved his goal.</w:t>
-      </w:r>
-    </w:p>
-    <w:p>
-      <w:pPr>
-        <w:pStyle w:val="ListParagraph"/>
-        <w:rPr>
-          <w:sz w:val="32"/>
-          <w:szCs w:val="32"/>
-        </w:rPr>
-      </w:pPr>
-    </w:p>
-    <w:p>
-      <w:pPr>
-        <w:pStyle w:val="ListParagraph"/>
-        <w:numPr>
-          <w:ilvl w:val="0"/>
-          <w:numId w:val="28"/>
-        </w:numPr>
-        <w:rPr>
-          <w:sz w:val="32"/>
-          <w:szCs w:val="32"/>
-        </w:rPr>
-      </w:pPr>
-      <w:r>
-        <w:rPr>
-          <w:sz w:val="32"/>
-          <w:szCs w:val="32"/>
-        </w:rPr>
-        <w:t>Rawlins (1993) states that ‘Tycho Brahe’s … “Thousand Star Catalog” published in 1598 … was one of history’s outstanding attempts at mass-perfectionism … it is of far greater magnificence than is now generally realised. In it Tycho realised, on a mass scale, a precision far greater than earlier catalogues. It represents an unprecedented confluence of skills: instrumental, observational and computational, all of which combined to enable Tycho to place most of the hundreds of recorded stars to an accuracy of 1 arcmin” (1/60th of a degree).</w:t>
-      </w:r>
-    </w:p>
-    <w:p>
-      <w:pPr>
-        <w:pStyle w:val="ListParagraph"/>
-        <w:rPr>
-          <w:sz w:val="32"/>
-          <w:szCs w:val="32"/>
-        </w:rPr>
-      </w:pPr>
-    </w:p>
-    <w:p>
-      <w:pPr>
-        <w:pStyle w:val="ListParagraph"/>
-        <w:numPr>
-          <w:ilvl w:val="0"/>
-          <w:numId w:val="28"/>
-        </w:numPr>
-        <w:rPr>
-          <w:sz w:val="32"/>
-          <w:szCs w:val="32"/>
-        </w:rPr>
-      </w:pPr>
-      <w:r>
-        <w:rPr>
-          <w:sz w:val="32"/>
-          <w:szCs w:val="32"/>
-        </w:rPr>
-        <w:t>Not ‘merely’ an observer</w:t>
-      </w:r>
-      <w:r>
-        <w:rPr>
-          <w:sz w:val="32"/>
-          <w:szCs w:val="32"/>
-        </w:rPr>
-        <w:t xml:space="preserve">, but </w:t>
-      </w:r>
-      <w:r>
-        <w:rPr>
-          <w:sz w:val="32"/>
-          <w:szCs w:val="32"/>
-        </w:rPr>
-        <w:t xml:space="preserve">also thought deeply about how the universe worked. </w:t>
-      </w:r>
-    </w:p>
-    <w:p>
-      <w:pPr>
-        <w:pStyle w:val="ListParagraph"/>
-        <w:rPr>
-          <w:sz w:val="32"/>
-          <w:szCs w:val="32"/>
-        </w:rPr>
-      </w:pPr>
-    </w:p>
-    <w:p>
-      <w:pPr>
-        <w:pStyle w:val="ListParagraph"/>
-        <w:numPr>
-          <w:ilvl w:val="0"/>
-          <w:numId w:val="28"/>
-        </w:numPr>
-        <w:rPr>
-          <w:sz w:val="32"/>
-          <w:szCs w:val="32"/>
-        </w:rPr>
-      </w:pPr>
-      <w:r>
-        <w:rPr>
-          <w:sz w:val="32"/>
-          <w:szCs w:val="32"/>
-        </w:rPr>
-        <w:t>He had his own theory of the Solar System and of the motions of the Moon.</w:t>
-      </w:r>
-    </w:p>
-    <w:p>
-      <w:pPr>
-        <w:pStyle w:val="ListParagraph"/>
-        <w:rPr>
-          <w:sz w:val="32"/>
-          <w:szCs w:val="32"/>
-        </w:rPr>
-      </w:pPr>
-    </w:p>
-    <w:p>
-      <w:pPr>
-        <w:pStyle w:val="ListParagraph"/>
-        <w:numPr>
-          <w:ilvl w:val="0"/>
-          <w:numId w:val="28"/>
-        </w:numPr>
-        <w:rPr>
-          <w:sz w:val="32"/>
-          <w:szCs w:val="32"/>
-        </w:rPr>
-      </w:pPr>
-      <w:r>
-        <w:rPr>
-          <w:sz w:val="32"/>
-          <w:szCs w:val="32"/>
-        </w:rPr>
-        <w:t xml:space="preserve">And he made several important discoveries. From his observations of the new star of 1572 and several comets he demolished the Aristotelian views that there could be no change in the heavens farther than the Moon and that the </w:t>
-      </w:r>
-      <w:r>
-        <w:rPr>
-          <w:sz w:val="32"/>
-          <w:szCs w:val="32"/>
-        </w:rPr>
-        <w:lastRenderedPageBreak/>
-        <w:t xml:space="preserve">planets were carried along in their orbits by perfect crystalline spheres. </w:t>
-      </w:r>
-    </w:p>
-    <w:p>
-      <w:pPr>
-        <w:pStyle w:val="ListParagraph"/>
-        <w:rPr>
-          <w:sz w:val="32"/>
-          <w:szCs w:val="32"/>
-        </w:rPr>
-      </w:pPr>
-    </w:p>
-    <w:p>
-      <w:pPr>
-        <w:pStyle w:val="ListParagraph"/>
-        <w:numPr>
-          <w:ilvl w:val="0"/>
-          <w:numId w:val="28"/>
-        </w:numPr>
-        <w:rPr>
-          <w:sz w:val="32"/>
-          <w:szCs w:val="32"/>
-        </w:rPr>
-      </w:pPr>
-      <w:r>
-        <w:rPr>
-          <w:sz w:val="32"/>
-          <w:szCs w:val="32"/>
-        </w:rPr>
-        <w:t>He was the first to realise that the tail of a comet always points away from the Sun, and that the direction of the Moon’s axis changes over time (nutation).</w:t>
-      </w:r>
-    </w:p>
-    <w:p>
-      <w:pPr>
-        <w:pStyle w:val="ListParagraph"/>
-        <w:rPr>
-          <w:sz w:val="32"/>
-          <w:szCs w:val="32"/>
-        </w:rPr>
-      </w:pPr>
-    </w:p>
-    <w:p>
-      <w:pPr>
-        <w:pStyle w:val="ListParagraph"/>
-        <w:numPr>
-          <w:ilvl w:val="0"/>
-          <w:numId w:val="28"/>
-        </w:numPr>
-        <w:rPr>
-          <w:sz w:val="32"/>
-          <w:szCs w:val="32"/>
-        </w:rPr>
-      </w:pPr>
-      <w:r>
-        <w:rPr>
-          <w:sz w:val="32"/>
-          <w:szCs w:val="32"/>
-        </w:rPr>
-        <w:t>Tycho made enormous strides in scientific instrumentation</w:t>
-      </w:r>
-      <w:r>
-        <w:rPr>
-          <w:sz w:val="32"/>
-          <w:szCs w:val="32"/>
-        </w:rPr>
-        <w:t xml:space="preserve">. </w:t>
-      </w:r>
-    </w:p>
-    <w:p>
-      <w:pPr>
-        <w:pStyle w:val="ListParagraph"/>
-        <w:rPr>
-          <w:sz w:val="32"/>
-          <w:szCs w:val="32"/>
-        </w:rPr>
-      </w:pPr>
-    </w:p>
-    <w:p>
-      <w:pPr>
-        <w:pStyle w:val="ListParagraph"/>
-        <w:numPr>
-          <w:ilvl w:val="0"/>
-          <w:numId w:val="28"/>
-        </w:numPr>
-        <w:rPr>
-          <w:sz w:val="32"/>
-          <w:szCs w:val="32"/>
-        </w:rPr>
-      </w:pPr>
-      <w:r>
-        <w:rPr>
-          <w:sz w:val="32"/>
-          <w:szCs w:val="32"/>
-        </w:rPr>
-        <w:t>He was the first person to understand the importance of taking multiple measurements</w:t>
-      </w:r>
-      <w:r>
-        <w:rPr>
-          <w:sz w:val="32"/>
-          <w:szCs w:val="32"/>
-        </w:rPr>
-        <w:t xml:space="preserve"> whereas previous to Tycho a single measurement was considered to be definitive. He was</w:t>
-      </w:r>
-      <w:r>
-        <w:rPr>
-          <w:sz w:val="32"/>
-          <w:szCs w:val="32"/>
-        </w:rPr>
-        <w:t xml:space="preserve"> the first to understand the role of measurement error, and invented techniques to reduce his data that are still used today. These are so fundamental to modern science that we take them for granted. Yet before Tycho they were unheard of.</w:t>
-      </w:r>
-    </w:p>
-    <w:p>
-      <w:pPr>
-        <w:pStyle w:val="ListParagraph"/>
-        <w:rPr>
-          <w:sz w:val="32"/>
-          <w:szCs w:val="32"/>
-        </w:rPr>
-      </w:pPr>
-    </w:p>
-    <w:p>
-      <w:pPr>
-        <w:pStyle w:val="ListParagraph"/>
-        <w:numPr>
-          <w:ilvl w:val="0"/>
-          <w:numId w:val="28"/>
-        </w:numPr>
-        <w:rPr>
-          <w:sz w:val="32"/>
-          <w:szCs w:val="32"/>
-        </w:rPr>
-      </w:pPr>
-      <w:r>
-        <w:rPr>
-          <w:sz w:val="32"/>
-          <w:szCs w:val="32"/>
-        </w:rPr>
-        <w:t>Perhaps most impressive was Tycho’s enormous capacity for bringing to bear the diverse talents of so many people to the realisation of his life’s work, and over such a long period (1574–1601). In so doing, Tycho created the world’s first research institute: Uraniborg, and the model for ’Big Science’ which he effectively invented.</w:t>
-      </w:r>
-    </w:p>
-    <w:p>
-      <w:pPr>
-        <w:pStyle w:val="ListParagraph"/>
-        <w:rPr>
-          <w:sz w:val="32"/>
-          <w:szCs w:val="32"/>
-        </w:rPr>
-      </w:pPr>
-    </w:p>
-    <w:p>
-      <w:pPr>
-        <w:pStyle w:val="ListParagraph"/>
-        <w:numPr>
-          <w:ilvl w:val="0"/>
-          <w:numId w:val="28"/>
-        </w:numPr>
-        <w:rPr>
-          <w:sz w:val="32"/>
-          <w:szCs w:val="32"/>
-        </w:rPr>
-      </w:pPr>
-      <w:r>
-        <w:rPr>
-          <w:sz w:val="32"/>
-          <w:szCs w:val="32"/>
-        </w:rPr>
-        <w:t>Tycho was fond of writing inscriptions which were dotted all over Uraniborg. Perhaps this one is the most appropriate with which to end:</w:t>
-      </w:r>
-    </w:p>
-    <w:p>
-      <w:pPr>
-        <w:pStyle w:val="ListParagraph"/>
-        <w:rPr>
-          <w:sz w:val="32"/>
-          <w:szCs w:val="32"/>
-        </w:rPr>
-      </w:pPr>
-    </w:p>
-    <w:p>
-      <w:pPr>
-        <w:pStyle w:val="ListParagraph"/>
-        <w:numPr>
-          <w:ilvl w:val="0"/>
-          <w:numId w:val="28"/>
-        </w:numPr>
-        <w:rPr>
-          <w:b/>
-          <w:bCs/>
-          <w:i/>
-          <w:iCs/>
-          <w:sz w:val="32"/>
-          <w:szCs w:val="32"/>
-        </w:rPr>
-      </w:pPr>
-      <w:r>
-        <w:rPr>
-          <w:b/>
-          <w:bCs/>
-          <w:i/>
-          <w:iCs/>
-          <w:sz w:val="32"/>
-          <w:szCs w:val="32"/>
-        </w:rPr>
-        <w:lastRenderedPageBreak/>
         <w:t>Neither wealth nor power, but only knowledge, alone, endures.</w:t>
       </w:r>
     </w:p>
@@ -10030,6 +10156,119 @@
     </w:lvl>
   </w:abstractNum>
   <w:abstractNum w:abstractNumId="21" w15:restartNumberingAfterBreak="0">
+    <w:nsid w:val="611B252D"/>
+    <w:multiLevelType w:val="hybridMultilevel"/>
+    <w:tmpl w:val="C7801784"/>
+    <w:lvl w:ilvl="0" w:tplc="08090001">
+      <w:start w:val="1"/>
+      <w:numFmt w:val="bullet"/>
+      <w:lvlText w:val=""/>
+      <w:lvlJc w:val="left"/>
+      <w:pPr>
+        <w:ind w:left="720" w:hanging="360"/>
+      </w:pPr>
+      <w:rPr>
+        <w:rFonts w:ascii="Symbol" w:hAnsi="Symbol" w:hint="default"/>
+      </w:rPr>
+    </w:lvl>
+    <w:lvl w:ilvl="1" w:tplc="08090003" w:tentative="1">
+      <w:start w:val="1"/>
+      <w:numFmt w:val="bullet"/>
+      <w:lvlText w:val="o"/>
+      <w:lvlJc w:val="left"/>
+      <w:pPr>
+        <w:ind w:left="1440" w:hanging="360"/>
+      </w:pPr>
+      <w:rPr>
+        <w:rFonts w:ascii="Courier New" w:hAnsi="Courier New" w:cs="Courier New" w:hint="default"/>
+      </w:rPr>
+    </w:lvl>
+    <w:lvl w:ilvl="2" w:tplc="08090005" w:tentative="1">
+      <w:start w:val="1"/>
+      <w:numFmt w:val="bullet"/>
+      <w:lvlText w:val=""/>
+      <w:lvlJc w:val="left"/>
+      <w:pPr>
+        <w:ind w:left="2160" w:hanging="360"/>
+      </w:pPr>
+      <w:rPr>
+        <w:rFonts w:ascii="Wingdings" w:hAnsi="Wingdings" w:hint="default"/>
+      </w:rPr>
+    </w:lvl>
+    <w:lvl w:ilvl="3" w:tplc="08090001" w:tentative="1">
+      <w:start w:val="1"/>
+      <w:numFmt w:val="bullet"/>
+      <w:lvlText w:val=""/>
+      <w:lvlJc w:val="left"/>
+      <w:pPr>
+        <w:ind w:left="2880" w:hanging="360"/>
+      </w:pPr>
+      <w:rPr>
+        <w:rFonts w:ascii="Symbol" w:hAnsi="Symbol" w:hint="default"/>
+      </w:rPr>
+    </w:lvl>
+    <w:lvl w:ilvl="4" w:tplc="08090003" w:tentative="1">
+      <w:start w:val="1"/>
+      <w:numFmt w:val="bullet"/>
+      <w:lvlText w:val="o"/>
+      <w:lvlJc w:val="left"/>
+      <w:pPr>
+        <w:ind w:left="3600" w:hanging="360"/>
+      </w:pPr>
+      <w:rPr>
+        <w:rFonts w:ascii="Courier New" w:hAnsi="Courier New" w:cs="Courier New" w:hint="default"/>
+      </w:rPr>
+    </w:lvl>
+    <w:lvl w:ilvl="5" w:tplc="08090005" w:tentative="1">
+      <w:start w:val="1"/>
+      <w:numFmt w:val="bullet"/>
+      <w:lvlText w:val=""/>
+      <w:lvlJc w:val="left"/>
+      <w:pPr>
+        <w:ind w:left="4320" w:hanging="360"/>
+      </w:pPr>
+      <w:rPr>
+        <w:rFonts w:ascii="Wingdings" w:hAnsi="Wingdings" w:hint="default"/>
+      </w:rPr>
+    </w:lvl>
+    <w:lvl w:ilvl="6" w:tplc="08090001" w:tentative="1">
+      <w:start w:val="1"/>
+      <w:numFmt w:val="bullet"/>
+      <w:lvlText w:val=""/>
+      <w:lvlJc w:val="left"/>
+      <w:pPr>
+        <w:ind w:left="5040" w:hanging="360"/>
+      </w:pPr>
+      <w:rPr>
+        <w:rFonts w:ascii="Symbol" w:hAnsi="Symbol" w:hint="default"/>
+      </w:rPr>
+    </w:lvl>
+    <w:lvl w:ilvl="7" w:tplc="08090003" w:tentative="1">
+      <w:start w:val="1"/>
+      <w:numFmt w:val="bullet"/>
+      <w:lvlText w:val="o"/>
+      <w:lvlJc w:val="left"/>
+      <w:pPr>
+        <w:ind w:left="5760" w:hanging="360"/>
+      </w:pPr>
+      <w:rPr>
+        <w:rFonts w:ascii="Courier New" w:hAnsi="Courier New" w:cs="Courier New" w:hint="default"/>
+      </w:rPr>
+    </w:lvl>
+    <w:lvl w:ilvl="8" w:tplc="08090005" w:tentative="1">
+      <w:start w:val="1"/>
+      <w:numFmt w:val="bullet"/>
+      <w:lvlText w:val=""/>
+      <w:lvlJc w:val="left"/>
+      <w:pPr>
+        <w:ind w:left="6480" w:hanging="360"/>
+      </w:pPr>
+      <w:rPr>
+        <w:rFonts w:ascii="Wingdings" w:hAnsi="Wingdings" w:hint="default"/>
+      </w:rPr>
+    </w:lvl>
+  </w:abstractNum>
+  <w:abstractNum w:abstractNumId="22" w15:restartNumberingAfterBreak="0">
     <w:nsid w:val="63AF6D82"/>
     <w:multiLevelType w:val="hybridMultilevel"/>
     <w:tmpl w:val="D71ABB60"/>
@@ -10142,7 +10381,7 @@
       </w:rPr>
     </w:lvl>
   </w:abstractNum>
-  <w:abstractNum w:abstractNumId="22" w15:restartNumberingAfterBreak="0">
+  <w:abstractNum w:abstractNumId="23" w15:restartNumberingAfterBreak="0">
     <w:nsid w:val="6B5979E8"/>
     <w:multiLevelType w:val="hybridMultilevel"/>
     <w:tmpl w:val="00F05744"/>
@@ -10255,7 +10494,7 @@
       </w:rPr>
     </w:lvl>
   </w:abstractNum>
-  <w:abstractNum w:abstractNumId="23" w15:restartNumberingAfterBreak="0">
+  <w:abstractNum w:abstractNumId="24" w15:restartNumberingAfterBreak="0">
     <w:nsid w:val="6C7D48D1"/>
     <w:multiLevelType w:val="multilevel"/>
     <w:tmpl w:val="60727184"/>
@@ -10404,7 +10643,7 @@
       </w:rPr>
     </w:lvl>
   </w:abstractNum>
-  <w:abstractNum w:abstractNumId="24" w15:restartNumberingAfterBreak="0">
+  <w:abstractNum w:abstractNumId="25" w15:restartNumberingAfterBreak="0">
     <w:nsid w:val="70234CC4"/>
     <w:multiLevelType w:val="hybridMultilevel"/>
     <w:tmpl w:val="FD125CA4"/>
@@ -10517,7 +10756,7 @@
       </w:rPr>
     </w:lvl>
   </w:abstractNum>
-  <w:abstractNum w:abstractNumId="25" w15:restartNumberingAfterBreak="0">
+  <w:abstractNum w:abstractNumId="26" w15:restartNumberingAfterBreak="0">
     <w:nsid w:val="72270B4E"/>
     <w:multiLevelType w:val="hybridMultilevel"/>
     <w:tmpl w:val="CB946CAE"/>
@@ -10630,7 +10869,7 @@
       </w:rPr>
     </w:lvl>
   </w:abstractNum>
-  <w:abstractNum w:abstractNumId="26" w15:restartNumberingAfterBreak="0">
+  <w:abstractNum w:abstractNumId="27" w15:restartNumberingAfterBreak="0">
     <w:nsid w:val="73804286"/>
     <w:multiLevelType w:val="hybridMultilevel"/>
     <w:tmpl w:val="7EDADF36"/>
@@ -10743,7 +10982,7 @@
       </w:rPr>
     </w:lvl>
   </w:abstractNum>
-  <w:abstractNum w:abstractNumId="27" w15:restartNumberingAfterBreak="0">
+  <w:abstractNum w:abstractNumId="28" w15:restartNumberingAfterBreak="0">
     <w:nsid w:val="78AF127A"/>
     <w:multiLevelType w:val="hybridMultilevel"/>
     <w:tmpl w:val="0B96F24E"/>
@@ -10856,7 +11095,7 @@
       </w:rPr>
     </w:lvl>
   </w:abstractNum>
-  <w:abstractNum w:abstractNumId="28" w15:restartNumberingAfterBreak="0">
+  <w:abstractNum w:abstractNumId="29" w15:restartNumberingAfterBreak="0">
     <w:nsid w:val="7F7171CE"/>
     <w:multiLevelType w:val="multilevel"/>
     <w:tmpl w:val="6C60FF7A"/>
@@ -11030,7 +11269,7 @@
     <w:abstractNumId w:val="14"/>
   </w:num>
   <w:num w:numId="5" w16cid:durableId="1296984492">
-    <w:abstractNumId w:val="28"/>
+    <w:abstractNumId w:val="29"/>
   </w:num>
   <w:num w:numId="6" w16cid:durableId="1815171972">
     <w:abstractNumId w:val="18"/>
@@ -11060,10 +11299,10 @@
     <w:abstractNumId w:val="16"/>
   </w:num>
   <w:num w:numId="15" w16cid:durableId="1688750747">
-    <w:abstractNumId w:val="26"/>
+    <w:abstractNumId w:val="27"/>
   </w:num>
   <w:num w:numId="16" w16cid:durableId="181748048">
-    <w:abstractNumId w:val="22"/>
+    <w:abstractNumId w:val="23"/>
   </w:num>
   <w:num w:numId="17" w16cid:durableId="62801113">
     <w:abstractNumId w:val="2"/>
@@ -11075,7 +11314,7 @@
     <w:abstractNumId w:val="9"/>
   </w:num>
   <w:num w:numId="20" w16cid:durableId="395709847">
-    <w:abstractNumId w:val="23"/>
+    <w:abstractNumId w:val="24"/>
   </w:num>
   <w:num w:numId="21" w16cid:durableId="1271889346">
     <w:abstractNumId w:val="15"/>
@@ -11090,25 +11329,28 @@
     <w:abstractNumId w:val="4"/>
   </w:num>
   <w:num w:numId="25" w16cid:durableId="1507132241">
-    <w:abstractNumId w:val="21"/>
+    <w:abstractNumId w:val="22"/>
   </w:num>
   <w:num w:numId="26" w16cid:durableId="1477188583">
     <w:abstractNumId w:val="10"/>
   </w:num>
   <w:num w:numId="27" w16cid:durableId="488441234">
-    <w:abstractNumId w:val="24"/>
+    <w:abstractNumId w:val="25"/>
   </w:num>
   <w:num w:numId="28" w16cid:durableId="124348258">
     <w:abstractNumId w:val="19"/>
   </w:num>
   <w:num w:numId="29" w16cid:durableId="1479615472">
-    <w:abstractNumId w:val="25"/>
+    <w:abstractNumId w:val="26"/>
   </w:num>
   <w:num w:numId="30" w16cid:durableId="1573076348">
-    <w:abstractNumId w:val="27"/>
+    <w:abstractNumId w:val="28"/>
   </w:num>
   <w:num w:numId="31" w16cid:durableId="565919161">
     <w:abstractNumId w:val="8"/>
+  </w:num>
+  <w:num w:numId="32" w16cid:durableId="1751150911">
+    <w:abstractNumId w:val="21"/>
   </w:num>
 </w:numbering>
 </file>

</xml_diff>